<commit_message>
melhorias no pódio, avatar com emoji e avanço manual da resposta
</commit_message>
<xml_diff>
--- a/questões-quiz.docx
+++ b/questões-quiz.docx
@@ -76,7 +76,13 @@
     </w:p>
     <w:p>
       <w:r>
-        <w:t>(Resposta: B)</w:t>
+        <w:t xml:space="preserve">(Resposta: </w:t>
+      </w:r>
+      <w:r>
+        <w:t>D</w:t>
+      </w:r>
+      <w:r>
+        <w:t>)</w:t>
       </w:r>
     </w:p>
     <w:p>
@@ -337,6 +343,7 @@
         <w:rPr>
           <w:b/>
           <w:bCs/>
+          <w:noProof/>
         </w:rPr>
         <w:drawing>
           <wp:inline distT="0" distB="0" distL="0" distR="0" wp14:anchorId="702ADDD5" wp14:editId="79FE14A5">
@@ -787,10 +794,7 @@
         <w:ind w:left="720" w:hanging="360"/>
       </w:pPr>
       <w:r>
-        <w:t xml:space="preserve">TEMA: </w:t>
-      </w:r>
-      <w:r>
-        <w:t xml:space="preserve">TERMINOLOGIA </w:t>
+        <w:t xml:space="preserve">TEMA: TERMINOLOGIA </w:t>
       </w:r>
     </w:p>
     <w:p>
@@ -1265,55 +1269,49 @@
       </w:r>
       <w:proofErr w:type="gramEnd"/>
       <w:r>
-        <w:t xml:space="preserve"> 80,4 </w:t>
-      </w:r>
+        <w:t xml:space="preserve"> 80,4 ºC</w:t>
+      </w:r>
+      <w:r>
+        <w:t> </w:t>
+      </w:r>
+    </w:p>
+    <w:p>
+      <w:r>
+        <w:t>B.</w:t>
+      </w:r>
+      <w:r>
+        <w:t xml:space="preserve"> </w:t>
+      </w:r>
+      <w:proofErr w:type="gramStart"/>
+      <w:r>
+        <w:t>Entre  </w:t>
+      </w:r>
+      <w:r>
+        <w:t>79</w:t>
+      </w:r>
+      <w:proofErr w:type="gramEnd"/>
+      <w:r>
+        <w:t xml:space="preserve">,25 </w:t>
+      </w:r>
+      <w:proofErr w:type="gramStart"/>
       <w:r>
         <w:t>ºC</w:t>
       </w:r>
       <w:r>
+        <w:t xml:space="preserve"> </w:t>
+      </w:r>
+      <w:r>
+        <w:t xml:space="preserve"> </w:t>
+      </w:r>
+      <w:r>
+        <w:t>e</w:t>
+      </w:r>
+      <w:proofErr w:type="gramEnd"/>
+      <w:r>
         <w:t> </w:t>
       </w:r>
-    </w:p>
-    <w:p>
-      <w:r>
-        <w:t>B.</w:t>
-      </w:r>
-      <w:r>
-        <w:t xml:space="preserve"> </w:t>
-      </w:r>
-      <w:proofErr w:type="gramStart"/>
-      <w:r>
-        <w:t>Entre  </w:t>
-      </w:r>
-      <w:r>
-        <w:t>79</w:t>
-      </w:r>
-      <w:proofErr w:type="gramEnd"/>
-      <w:r>
-        <w:t xml:space="preserve">,25 </w:t>
-      </w:r>
-      <w:proofErr w:type="gramStart"/>
-      <w:r>
-        <w:t>ºC</w:t>
-      </w:r>
-      <w:r>
-        <w:t xml:space="preserve"> </w:t>
-      </w:r>
-      <w:r>
-        <w:t xml:space="preserve"> </w:t>
-      </w:r>
-      <w:r>
-        <w:t>e</w:t>
-      </w:r>
-      <w:proofErr w:type="gramEnd"/>
-      <w:r>
-        <w:t> </w:t>
-      </w:r>
-      <w:r>
-        <w:t xml:space="preserve">80,75 </w:t>
-      </w:r>
-      <w:r>
-        <w:t>ºC</w:t>
+      <w:r>
+        <w:t>80,75 ºC</w:t>
       </w:r>
     </w:p>
     <w:p>
@@ -1327,19 +1325,13 @@
         <w:t>Entre</w:t>
       </w:r>
       <w:r>
-        <w:t xml:space="preserve"> 79,5 </w:t>
-      </w:r>
-      <w:r>
-        <w:t>ºC</w:t>
+        <w:t xml:space="preserve"> 79,5 ºC</w:t>
       </w:r>
       <w:r>
         <w:t> e</w:t>
       </w:r>
       <w:r>
-        <w:t xml:space="preserve"> 80,5 </w:t>
-      </w:r>
-      <w:r>
-        <w:t>ºC</w:t>
+        <w:t xml:space="preserve"> 80,5 ºC</w:t>
       </w:r>
       <w:r>
         <w:t> </w:t>
@@ -1967,19 +1959,7 @@
           <w:rPr>
             <w:rFonts w:ascii="Cambria Math" w:hAnsi="Cambria Math"/>
           </w:rPr>
-          <m:t>±</m:t>
-        </m:r>
-        <m:r>
-          <w:rPr>
-            <w:rFonts w:ascii="Cambria Math" w:hAnsi="Cambria Math"/>
-          </w:rPr>
-          <m:t>4</m:t>
-        </m:r>
-        <m:r>
-          <w:rPr>
-            <w:rFonts w:ascii="Cambria Math" w:hAnsi="Cambria Math"/>
-          </w:rPr>
-          <m:t>,5V</m:t>
+          <m:t>±4,5V</m:t>
         </m:r>
       </m:oMath>
     </w:p>
@@ -1999,19 +1979,7 @@
           <w:rPr>
             <w:rFonts w:ascii="Cambria Math" w:hAnsi="Cambria Math"/>
           </w:rPr>
-          <m:t>±</m:t>
-        </m:r>
-        <m:r>
-          <w:rPr>
-            <w:rFonts w:ascii="Cambria Math" w:hAnsi="Cambria Math"/>
-          </w:rPr>
-          <m:t>45</m:t>
-        </m:r>
-        <m:r>
-          <w:rPr>
-            <w:rFonts w:ascii="Cambria Math" w:hAnsi="Cambria Math"/>
-          </w:rPr>
-          <m:t>V</m:t>
+          <m:t>±45V</m:t>
         </m:r>
       </m:oMath>
     </w:p>
@@ -2031,19 +1999,7 @@
           <w:rPr>
             <w:rFonts w:ascii="Cambria Math" w:hAnsi="Cambria Math"/>
           </w:rPr>
-          <m:t>±</m:t>
-        </m:r>
-        <m:r>
-          <w:rPr>
-            <w:rFonts w:ascii="Cambria Math" w:hAnsi="Cambria Math"/>
-          </w:rPr>
-          <m:t>3</m:t>
-        </m:r>
-        <m:r>
-          <w:rPr>
-            <w:rFonts w:ascii="Cambria Math" w:hAnsi="Cambria Math"/>
-          </w:rPr>
-          <m:t>V</m:t>
+          <m:t>±3V</m:t>
         </m:r>
       </m:oMath>
     </w:p>
@@ -2770,6 +2726,7 @@
   <w:style w:type="character" w:default="1" w:styleId="Fontepargpadro">
     <w:name w:val="Default Paragraph Font"/>
     <w:uiPriority w:val="1"/>
+    <w:semiHidden/>
     <w:unhideWhenUsed/>
   </w:style>
   <w:style w:type="table" w:default="1" w:styleId="Tabelanormal">

</xml_diff>